<commit_message>
feat: Add Generated PDF preview/generation feature to CorrespondenceEvaluator; normalize year level display across all scholar pages
- Add PDF generation and preview functionality to CorrespondenceEvaluator.jsx (same pattern as OfficerManualValidation.jsx)
- Implement handleGeneratePdf and handlePreview state management and handlers
- Add FilePreviewModal component for in-page PDF previewing
- Fix Scholar ID visibility in Letter Summary section
- Implement normalizeYearLevel function to convert database formats (college_3) to UI formats (3rd Year College)
- Enrich scholar data during transformation to ensure year_level and scholar_id are available on all letters
- Ensure consistent year level formatting across all admin/officer pages
</commit_message>
<xml_diff>
--- a/server/templates/letter-template.docx
+++ b/server/templates/letter-template.docx
@@ -345,458 +345,75 @@
         </w:rPr>
       </w:r>
     </w:p>
-    <w:p>
-      <w:r>
-        <w:t xml:space="preserve">{%photo1}</w:t>
-      </w:r>
-    </w:p>
-    <w:p>
-      <w:pPr>
-        <w:rPr/>
-      </w:pPr>
-      <w:r>
-        <w:rPr>
-          <w:rtl w:val="0"/>
-        </w:rPr>
-        <w:t xml:space="preserve">{documentation1_caption}</w:t>
-      </w:r>
-    </w:p>
-    <w:p>
-      <w:pPr>
-        <w:rPr/>
-      </w:pPr>
-      <w:r>
-        <w:rPr>
-          <w:rtl w:val="0"/>
-        </w:rPr>
-      </w:r>
-    </w:p>
-    <w:p>
-      <w:pPr>
-        <w:rPr/>
-      </w:pPr>
-      <w:r>
-        <w:rPr>
-          <w:rtl w:val="0"/>
-        </w:rPr>
-      </w:r>
-    </w:p>
-    <w:p>
-      <w:pPr>
-        <w:rPr/>
-      </w:pPr>
-      <w:r>
-        <w:rPr>
-          <w:rtl w:val="0"/>
-        </w:rPr>
-      </w:r>
-    </w:p>
-    <w:p>
-      <w:pPr>
-        <w:rPr/>
-      </w:pPr>
-      <w:r>
-        <w:rPr>
-          <w:rtl w:val="0"/>
-        </w:rPr>
-      </w:r>
-    </w:p>
-    <w:p>
-      <w:pPr>
-        <w:rPr/>
-      </w:pPr>
-      <w:r>
-        <w:rPr>
-          <w:rtl w:val="0"/>
-        </w:rPr>
-      </w:r>
-    </w:p>
-    <w:p>
-      <w:pPr>
-        <w:rPr/>
-      </w:pPr>
-      <w:r>
-        <w:rPr>
-          <w:rtl w:val="0"/>
-        </w:rPr>
-      </w:r>
-    </w:p>
-    <w:p>
-      <w:pPr>
-        <w:rPr/>
-      </w:pPr>
-      <w:r>
-        <w:rPr>
-          <w:rtl w:val="0"/>
-        </w:rPr>
-      </w:r>
-    </w:p>
-    <w:p>
-      <w:pPr>
-        <w:rPr/>
-      </w:pPr>
-      <w:r>
-        <w:rPr>
-          <w:rtl w:val="0"/>
-        </w:rPr>
-      </w:r>
-    </w:p>
-    <w:p>
-      <w:pPr>
-        <w:rPr/>
-      </w:pPr>
-      <w:r>
-        <w:rPr>
-          <w:rtl w:val="0"/>
-        </w:rPr>
-      </w:r>
-    </w:p>
-    <w:p>
-      <w:pPr>
-        <w:rPr/>
-      </w:pPr>
-      <w:r>
-        <w:rPr>
-          <w:rtl w:val="0"/>
-        </w:rPr>
-      </w:r>
-    </w:p>
-    <w:p>
-      <w:pPr>
-        <w:rPr/>
-      </w:pPr>
-      <w:r>
-        <w:rPr>
-          <w:rtl w:val="0"/>
-        </w:rPr>
-      </w:r>
-    </w:p>
-    <w:p>
-      <w:pPr>
-        <w:rPr/>
-      </w:pPr>
-      <w:r>
-        <w:rPr>
-          <w:rtl w:val="0"/>
-        </w:rPr>
-      </w:r>
-    </w:p>
-    <w:p>
-      <w:pPr>
-        <w:rPr/>
-      </w:pPr>
-      <w:r>
-        <w:rPr>
-          <w:rtl w:val="0"/>
-        </w:rPr>
-      </w:r>
-    </w:p>
-    <w:p>
-      <w:pPr>
-        <w:rPr/>
-      </w:pPr>
-      <w:r>
-        <w:rPr>
-          <w:rtl w:val="0"/>
-        </w:rPr>
-      </w:r>
-    </w:p>
-    <w:p>
-      <w:pPr>
-        <w:rPr/>
-      </w:pPr>
-      <w:r>
-        <w:rPr>
-          <w:rtl w:val="0"/>
-        </w:rPr>
-      </w:r>
-    </w:p>
-    <w:p>
-      <w:pPr>
-        <w:rPr/>
-      </w:pPr>
-      <w:r>
-        <w:rPr>
-          <w:rtl w:val="0"/>
-        </w:rPr>
-      </w:r>
-    </w:p>
-    <w:p>
-      <w:pPr>
-        <w:rPr/>
-      </w:pPr>
-      <w:r>
-        <w:rPr>
-          <w:rtl w:val="0"/>
-        </w:rPr>
-      </w:r>
-    </w:p>
-    <w:p>
-      <w:pPr>
-        <w:rPr/>
-      </w:pPr>
-      <w:r>
-        <w:rPr>
-          <w:rtl w:val="0"/>
-        </w:rPr>
-      </w:r>
-    </w:p>
-    <w:p>
-      <w:pPr>
-        <w:rPr/>
-      </w:pPr>
-      <w:r>
-        <w:rPr>
-          <w:rtl w:val="0"/>
-        </w:rPr>
-      </w:r>
-    </w:p>
-    <w:p>
-      <w:pPr>
-        <w:rPr/>
-      </w:pPr>
-      <w:r>
-        <w:rPr>
-          <w:rtl w:val="0"/>
-        </w:rPr>
-      </w:r>
-    </w:p>
-    <w:p>
-      <w:pPr>
-        <w:rPr/>
-      </w:pPr>
-      <w:r>
-        <w:rPr>
-          <w:rtl w:val="0"/>
-        </w:rPr>
-      </w:r>
-    </w:p>
-    <w:p>
-      <w:pPr>
-        <w:rPr/>
-      </w:pPr>
-      <w:r>
-        <w:rPr>
-          <w:rtl w:val="0"/>
-        </w:rPr>
-      </w:r>
-    </w:p>
-    <w:p>
-      <w:pPr>
-        <w:rPr/>
-      </w:pPr>
-      <w:r>
-        <w:rPr>
-          <w:rtl w:val="0"/>
-        </w:rPr>
-      </w:r>
-    </w:p>
-    <w:p>
-      <w:pPr>
-        <w:rPr/>
-      </w:pPr>
-      <w:r>
-        <w:rPr>
-          <w:rtl w:val="0"/>
-        </w:rPr>
-      </w:r>
-    </w:p>
-    <w:p>
-      <w:pPr>
-        <w:rPr/>
-      </w:pPr>
-      <w:r>
-        <w:rPr>
-          <w:rtl w:val="0"/>
-        </w:rPr>
-      </w:r>
-    </w:p>
-    <w:p>
-      <w:pPr>
-        <w:rPr/>
-      </w:pPr>
-      <w:r>
-        <w:rPr>
-          <w:rtl w:val="0"/>
-        </w:rPr>
-      </w:r>
-    </w:p>
-    <w:p>
-      <w:pPr>
-        <w:rPr/>
-      </w:pPr>
-      <w:r>
-        <w:rPr>
-          <w:rtl w:val="0"/>
-        </w:rPr>
-      </w:r>
-    </w:p>
-    <w:p>
-      <w:pPr>
-        <w:rPr/>
-      </w:pPr>
-      <w:r>
-        <w:rPr>
-          <w:rtl w:val="0"/>
-        </w:rPr>
-      </w:r>
-    </w:p>
-    <w:p>
-      <w:pPr>
-        <w:rPr/>
-      </w:pPr>
-      <w:r>
-        <w:rPr>
-          <w:rtl w:val="0"/>
-        </w:rPr>
-      </w:r>
-    </w:p>
-    <w:p>
-      <w:pPr>
-        <w:rPr/>
-      </w:pPr>
-      <w:r>
-        <w:rPr>
-          <w:rtl w:val="0"/>
-        </w:rPr>
-      </w:r>
-    </w:p>
-    <w:p>
-      <w:pPr>
-        <w:rPr/>
-      </w:pPr>
-      <w:r>
-        <w:rPr>
-          <w:rtl w:val="0"/>
-        </w:rPr>
-      </w:r>
-    </w:p>
-    <w:p>
-      <w:pPr>
-        <w:rPr/>
-      </w:pPr>
-      <w:r>
-        <w:rPr>
-          <w:rtl w:val="0"/>
-        </w:rPr>
-      </w:r>
-    </w:p>
-    <w:p>
-      <w:pPr>
-        <w:rPr/>
-      </w:pPr>
-      <w:r>
-        <w:rPr>
-          <w:rtl w:val="0"/>
-        </w:rPr>
-      </w:r>
-    </w:p>
-    <w:p>
-      <w:pPr>
-        <w:rPr/>
-      </w:pPr>
-      <w:r>
-        <w:rPr>
-          <w:rtl w:val="0"/>
-        </w:rPr>
-      </w:r>
-    </w:p>
-    <w:p>
-      <w:pPr>
-        <w:rPr/>
-      </w:pPr>
-      <w:r>
-        <w:rPr>
-          <w:rtl w:val="0"/>
-        </w:rPr>
-      </w:r>
-    </w:p>
-    <w:p>
-      <w:pPr>
-        <w:rPr/>
-      </w:pPr>
-      <w:r>
-        <w:rPr>
-          <w:rtl w:val="0"/>
-        </w:rPr>
-      </w:r>
-    </w:p>
-    <w:p>
-      <w:pPr>
-        <w:rPr/>
-      </w:pPr>
-      <w:r>
-        <w:rPr>
-          <w:rtl w:val="0"/>
-        </w:rPr>
-      </w:r>
-    </w:p>
-    <w:p>
-      <w:pPr>
-        <w:rPr/>
-      </w:pPr>
-      <w:r>
-        <w:rPr>
-          <w:rtl w:val="0"/>
-        </w:rPr>
-      </w:r>
-    </w:p>
-    <w:p>
-      <w:pPr>
-        <w:rPr/>
-      </w:pPr>
-      <w:r>
-        <w:rPr>
-          <w:rtl w:val="0"/>
-        </w:rPr>
-      </w:r>
-    </w:p>
-    <w:p>
-      <w:pPr>
-        <w:rPr/>
-      </w:pPr>
-      <w:r>
-        <w:rPr>
-          <w:rtl w:val="0"/>
-        </w:rPr>
-      </w:r>
-    </w:p>
-    <w:p>
-      <w:pPr>
-        <w:rPr/>
-      </w:pPr>
-      <w:r>
-        <w:rPr>
-          <w:rtl w:val="0"/>
-        </w:rPr>
-      </w:r>
-    </w:p>
-    <w:p>
-      <w:pPr>
-        <w:rPr/>
-      </w:pPr>
-      <w:r>
-        <w:rPr>
-          <w:rtl w:val="0"/>
-        </w:rPr>
-      </w:r>
-    </w:p>
-    <w:p>
-      <w:r>
-        <w:t xml:space="preserve">{%photo2}</w:t>
-      </w:r>
-    </w:p>
-    <w:p>
-      <w:pPr>
-        <w:rPr/>
-      </w:pPr>
-      <w:r>
-        <w:rPr>
-          <w:rtl w:val="0"/>
-        </w:rPr>
-        <w:t xml:space="preserve">{documentation2_caption}</w:t>
-      </w:r>
-    </w:p>
+    <w:tbl>
+      <w:tblPr>
+        <w:tblW w:w="9638" w:type="dxa"/>
+        <w:tblBorders>
+          <w:top w:val="nil" w:sz="0" w:space="0" w:color="auto"/>
+          <w:left w:val="nil" w:sz="0" w:space="0" w:color="auto"/>
+          <w:bottom w:val="nil" w:sz="0" w:space="0" w:color="auto"/>
+          <w:right w:val="nil" w:sz="0" w:space="0" w:color="auto"/>
+          <w:insideH w:val="nil" w:sz="0" w:space="0" w:color="auto"/>
+          <w:insideV w:val="nil" w:sz="0" w:space="0" w:color="auto"/>
+        </w:tblBorders>
+        <w:tblCellMar>
+          <w:top w:w="0" w:type="dxa"/>
+          <w:left w:w="0" w:type="dxa"/>
+          <w:bottom w:w="0" w:type="dxa"/>
+          <w:right w:w="0" w:type="dxa"/>
+        </w:tblCellMar>
+      </w:tblPr>
+      <w:tblGrid>
+        <w:gridCol w:w="4800"/>
+        <w:gridCol w:w="4800"/>
+      </w:tblGrid>
+      <w:tr>
+        <w:tcPr/>
+        <w:tc>
+          <w:tcPr>
+            <w:tcW w:w="4800" w:type="dxa"/>
+          </w:tcPr>
+          <w:p>
+            <w:r>
+              <w:t xml:space="preserve">{%photo1}</w:t>
+            </w:r>
+          </w:p>
+        </w:tc>
+        <w:tc>
+          <w:tcPr>
+            <w:tcW w:w="4800" w:type="dxa"/>
+          </w:tcPr>
+          <w:p>
+            <w:r>
+              <w:t xml:space="preserve">{%photo2}</w:t>
+            </w:r>
+          </w:p>
+        </w:tc>
+      </w:tr>
+      <w:tr>
+        <w:tcPr/>
+        <w:tc>
+          <w:tcPr>
+            <w:tcW w:w="4800" w:type="dxa"/>
+          </w:tcPr>
+          <w:p>
+            <w:r>
+              <w:t xml:space="preserve">{documentation1_caption}</w:t>
+            </w:r>
+          </w:p>
+        </w:tc>
+        <w:tc>
+          <w:tcPr>
+            <w:tcW w:w="4800" w:type="dxa"/>
+          </w:tcPr>
+          <w:p>
+            <w:r>
+              <w:t xml:space="preserve">{documentation2_caption}</w:t>
+            </w:r>
+          </w:p>
+        </w:tc>
+      </w:tr>
+    </w:tbl>
     <w:p>
       <w:pPr>
         <w:rPr/>

</xml_diff>